<commit_message>
Publica revisao validada com capturas reais e autoria
</commit_message>
<xml_diff>
--- a/documentacao/RELATORIO.docx
+++ b/documentacao/RELATORIO.docx
@@ -1,6 +1,6 @@
 
 <file path=word/document.xml><?xml version="1.0" encoding="utf-8"?>
-<w:document xmlns:w="http://schemas.openxmlformats.org/wordprocessingml/2006/main">
+<w:document xmlns:w="http://schemas.openxmlformats.org/wordprocessingml/2006/main" xmlns:r="http://schemas.openxmlformats.org/officeDocument/2006/relationships" xmlns:wp="http://schemas.openxmlformats.org/drawingml/2006/wordprocessingDrawing" xmlns:a="http://schemas.openxmlformats.org/drawingml/2006/main" xmlns:pic="http://schemas.openxmlformats.org/drawingml/2006/picture">
   <w:body>
     <w:p>
       <w:pPr>
@@ -25,7 +25,7 @@
           <w:rFonts w:ascii="Arial" w:hAnsi="Arial"/>
           <w:sz w:val="23"/>
         </w:rPr>
-        <w:t xml:space="preserve">Aluno e turma: preencher.</w:t>
+        <w:t xml:space="preserve">Autores: Lucas Kohagura, Pedro Luis e Joao Pedro Lopes.</w:t>
       </w:r>
     </w:p>
     <w:p>
@@ -280,78 +280,337 @@
     </w:p>
     <w:p>
       <w:pPr>
-        <w:spacing w:after="140"/>
-      </w:pPr>
-      <w:r>
-        <w:rPr>
-          <w:rFonts w:ascii="Arial" w:hAnsi="Arial"/>
-          <w:sz w:val="23"/>
-        </w:rPr>
-        <w:t xml:space="preserve">Essas verificações são estáticas e de preparação. Não demonstram que os contêineres desta revisão funcionam em conjunto.</w:t>
-      </w:r>
-    </w:p>
-    <w:p>
-      <w:pPr>
-        <w:keepNext/>
-        <w:spacing w:after="140"/>
-      </w:pPr>
-      <w:r>
-        <w:rPr>
-          <w:b/>
-          <w:rFonts w:ascii="Arial" w:hAnsi="Arial"/>
-          <w:sz w:val="28"/>
-        </w:rPr>
-        <w:t xml:space="preserve">Bloqueio e testes pendentes</w:t>
-      </w:r>
-    </w:p>
-    <w:p>
-      <w:pPr>
-        <w:spacing w:after="140"/>
-      </w:pPr>
-      <w:r>
-        <w:rPr>
-          <w:rFonts w:ascii="Arial" w:hAnsi="Arial"/>
-          <w:sz w:val="23"/>
-        </w:rPr>
-        <w:t xml:space="preserve">O perfil Colima dedicado foi encontrado parado e a tentativa de retomada informou estado Broken, com processo existente e socket recusando conexão. Não foi forçada a parada do processo nem alterado o perfil padrão. Os dados e a implementação anterior permanecem preservados.</w:t>
-      </w:r>
-    </w:p>
-    <w:p>
-      <w:pPr>
-        <w:spacing w:after="140"/>
-      </w:pPr>
-      <w:r>
-        <w:rPr>
-          <w:rFonts w:ascii="Arial" w:hAnsi="Arial"/>
-          <w:sz w:val="23"/>
-        </w:rPr>
-        <w:t xml:space="preserve">Ainda são necessários: php -l na versão PHP 7.2, nginx -t, início dos cinco serviços, instalação WordPress, HTTP 200, alternância de três X-Upstream, igualdade do conteúdo entre instâncias, consulta ao banco, teste de persistência após parar/retomar e screenshots reais desta revisão. Nenhuma evidência de outra configuração foi apresentada como prova do código atual.</w:t>
-      </w:r>
-    </w:p>
-    <w:p>
-      <w:pPr>
-        <w:keepNext/>
-        <w:spacing w:after="140"/>
-      </w:pPr>
-      <w:r>
-        <w:rPr>
-          <w:b/>
-          <w:rFonts w:ascii="Arial" w:hAnsi="Arial"/>
-          <w:sz w:val="28"/>
-        </w:rPr>
-        <w:t xml:space="preserve">Conclusão provisória</w:t>
-      </w:r>
-    </w:p>
-    <w:p>
-      <w:pPr>
-        <w:spacing w:after="140"/>
-      </w:pPr>
-      <w:r>
-        <w:rPr>
-          <w:rFonts w:ascii="Arial" w:hAnsi="Arial"/>
-          <w:sz w:val="23"/>
-        </w:rPr>
-        <w:t xml:space="preserve">A revisão passou nas verificações estruturais e de preparação. A aprovação funcional permanece pendente da recuperação do ambiente dedicado e da execução dos testes descritos. Esta conclusão registra o limite observado e não afirma funcionamento que ainda não foi comprovado.</w:t>
+        <w:keepNext/>
+        <w:spacing w:after="140"/>
+      </w:pPr>
+      <w:r>
+        <w:rPr>
+          <w:b/>
+          <w:rFonts w:ascii="Arial" w:hAnsi="Arial"/>
+          <w:sz w:val="28"/>
+        </w:rPr>
+        <w:t xml:space="preserve">Resultados da execução</w:t>
+      </w:r>
+    </w:p>
+    <w:p>
+      <w:pPr>
+        <w:spacing w:after="140"/>
+      </w:pPr>
+      <w:r>
+        <w:rPr>
+          <w:rFonts w:ascii="Arial" w:hAnsi="Arial"/>
+          <w:sz w:val="23"/>
+        </w:rPr>
+        <w:t xml:space="preserve">Em 15/10/2026, os cinco serviços foram executados no perfil Docker dedicado. MySQL e os três WordPress ficaram saudáveis; Nginx respondeu pela única porta publicada, 127.0.0.1:8086. A validação nginx -t e a análise php -l foram concluídas sem erro.</w:t>
+      </w:r>
+    </w:p>
+    <w:p>
+      <w:pPr>
+        <w:spacing w:after="140"/>
+      </w:pPr>
+      <w:r>
+        <w:rPr>
+          <w:rFonts w:ascii="Arial" w:hAnsi="Arial"/>
+          <w:sz w:val="23"/>
+        </w:rPr>
+        <w:t xml:space="preserve">O WordPress foi instalado em banco próprio, com conteúdo inicial de demonstração e usuário fictício. A consulta confirmou 12 tabelas no banco experimento. Nove requisições retornaram HTTP 200, com três destinos: 172.20.0.2:80, 172.20.0.3:80 e 172.20.0.4:80. O SHA-256 do HTML foi igual nas nove respostas. Os IPs são internos e podem mudar em outra execução.</w:t>
+      </w:r>
+    </w:p>
+    <w:p>
+      <w:pPr>
+        <w:spacing w:after="140"/>
+      </w:pPr>
+      <w:r>
+        <w:rPr>
+          <w:rFonts w:ascii="Arial" w:hAnsi="Arial"/>
+          <w:sz w:val="23"/>
+        </w:rPr>
+        <w:t xml:space="preserve">O projeto foi parado com docker-compose stop e retomado com docker-compose up -d. Após a retomada, o verificador voltou a registrar APROVADO_RUNTIME, com acesso ao banco e à página instalada. O log de persistência e o registro de runtime estão anexados na pasta de evidências. Não foi executado teste de carga.</w:t>
+      </w:r>
+    </w:p>
+    <w:p>
+      <w:pPr>
+        <w:keepNext/>
+        <w:spacing w:after="140"/>
+      </w:pPr>
+      <w:r>
+        <w:rPr>
+          <w:b/>
+          <w:rFonts w:ascii="Arial" w:hAnsi="Arial"/>
+          <w:sz w:val="28"/>
+        </w:rPr>
+        <w:t xml:space="preserve">Evidências</w:t>
+      </w:r>
+    </w:p>
+    <w:p>
+      <w:pPr>
+        <w:spacing w:after="140"/>
+      </w:pPr>
+      <w:r>
+        <w:rPr>
+          <w:rFonts w:ascii="Arial" w:hAnsi="Arial"/>
+          <w:sz w:val="23"/>
+        </w:rPr>
+        <w:t xml:space="preserve">As figuras são capturas reais desta execução: três capturas de Terminal e a página instalada em navegador Chromium com perfil isolado. As capturas do Terminal excluem a barra de título com identificadores pessoais. Nenhuma imagem foi gerada a partir de logs. O registro navegador-http.json documenta nove respostas HTTP observadas no navegador.</w:t>
+      </w:r>
+    </w:p>
+    <w:p>
+      <w:pPr>
+        <w:pageBreakBefore/>
+        <w:keepNext/>
+      </w:pPr>
+      <w:r>
+        <w:t>Figura 1. Cinco serviços ativos e porta publicada somente no Nginx.</w:t>
+      </w:r>
+    </w:p>
+    <w:p>
+      <w:r>
+        <w:drawing>
+          <wp:inline>
+            <wp:extent cx="6048000" cy="3211488"/>
+            <wp:docPr id="1" name="Captura real 1" descr="Cinco serviços ativos e porta publicada somente no Nginx."/>
+            <a:graphic>
+              <a:graphicData uri="http://schemas.openxmlformats.org/drawingml/2006/picture">
+                <pic:pic>
+                  <pic:nvPicPr>
+                    <pic:cNvPr id="1" name="01-terminal-containers.png"/>
+                    <pic:cNvPicPr/>
+                  </pic:nvPicPr>
+                  <pic:blipFill>
+                    <a:blip r:embed="rId1"/>
+                    <a:stretch>
+                      <a:fillRect/>
+                    </a:stretch>
+                  </pic:blipFill>
+                  <pic:spPr>
+                    <a:xfrm>
+                      <a:off x="0" y="0"/>
+                      <a:ext cx="6048000" cy="3211488"/>
+                    </a:xfrm>
+                    <a:prstGeom prst="rect">
+                      <a:avLst/>
+                    </a:prstGeom>
+                  </pic:spPr>
+                </pic:pic>
+              </a:graphicData>
+            </a:graphic>
+          </wp:inline>
+        </w:drawing>
+      </w:r>
+    </w:p>
+    <w:p>
+      <w:pPr>
+        <w:pageBreakBefore/>
+        <w:keepNext/>
+      </w:pPr>
+      <w:r>
+        <w:t>Figura 2. Nove requisições, três valores X-Upstream e resposta HTTP 200.</w:t>
+      </w:r>
+    </w:p>
+    <w:p>
+      <w:r>
+        <w:drawing>
+          <wp:inline>
+            <wp:extent cx="6048000" cy="3211488"/>
+            <wp:docPr id="2" name="Captura real 2" descr="Nove requisições, três valores X-Upstream e resposta HTTP 200."/>
+            <a:graphic>
+              <a:graphicData uri="http://schemas.openxmlformats.org/drawingml/2006/picture">
+                <pic:pic>
+                  <pic:nvPicPr>
+                    <pic:cNvPr id="2" name="02-terminal-balanceamento.png"/>
+                    <pic:cNvPicPr/>
+                  </pic:nvPicPr>
+                  <pic:blipFill>
+                    <a:blip r:embed="rId2"/>
+                    <a:stretch>
+                      <a:fillRect/>
+                    </a:stretch>
+                  </pic:blipFill>
+                  <pic:spPr>
+                    <a:xfrm>
+                      <a:off x="0" y="0"/>
+                      <a:ext cx="6048000" cy="3211488"/>
+                    </a:xfrm>
+                    <a:prstGeom prst="rect">
+                      <a:avLst/>
+                    </a:prstGeom>
+                  </pic:spPr>
+                </pic:pic>
+              </a:graphicData>
+            </a:graphic>
+          </wp:inline>
+        </w:drawing>
+      </w:r>
+    </w:p>
+    <w:p>
+      <w:pPr>
+        <w:pageBreakBefore/>
+        <w:keepNext/>
+      </w:pPr>
+      <w:r>
+        <w:t>Figura 3. Nginx, PHP, verificador e consulta às 12 tabelas.</w:t>
+      </w:r>
+    </w:p>
+    <w:p>
+      <w:r>
+        <w:drawing>
+          <wp:inline>
+            <wp:extent cx="6048000" cy="3211488"/>
+            <wp:docPr id="3" name="Captura real 3" descr="Nginx, PHP, verificador e consulta às 12 tabelas."/>
+            <a:graphic>
+              <a:graphicData uri="http://schemas.openxmlformats.org/drawingml/2006/picture">
+                <pic:pic>
+                  <pic:nvPicPr>
+                    <pic:cNvPr id="3" name="03-terminal-validacao.png"/>
+                    <pic:cNvPicPr/>
+                  </pic:nvPicPr>
+                  <pic:blipFill>
+                    <a:blip r:embed="rId3"/>
+                    <a:stretch>
+                      <a:fillRect/>
+                    </a:stretch>
+                  </pic:blipFill>
+                  <pic:spPr>
+                    <a:xfrm>
+                      <a:off x="0" y="0"/>
+                      <a:ext cx="6048000" cy="3211488"/>
+                    </a:xfrm>
+                    <a:prstGeom prst="rect">
+                      <a:avLst/>
+                    </a:prstGeom>
+                  </pic:spPr>
+                </pic:pic>
+              </a:graphicData>
+            </a:graphic>
+          </wp:inline>
+        </w:drawing>
+      </w:r>
+    </w:p>
+    <w:p>
+      <w:pPr>
+        <w:pageBreakBefore/>
+        <w:keepNext/>
+      </w:pPr>
+      <w:r>
+        <w:t>Figura 4. Página WordPress instalada, capturada em desktop.</w:t>
+      </w:r>
+    </w:p>
+    <w:p>
+      <w:r>
+        <w:drawing>
+          <wp:inline>
+            <wp:extent cx="6048000" cy="5901000"/>
+            <wp:docPr id="4" name="Captura real 4" descr="Página WordPress instalada, capturada em desktop."/>
+            <a:graphic>
+              <a:graphicData uri="http://schemas.openxmlformats.org/drawingml/2006/picture">
+                <pic:pic>
+                  <pic:nvPicPr>
+                    <pic:cNvPr id="4" name="site-desktop.png"/>
+                    <pic:cNvPicPr/>
+                  </pic:nvPicPr>
+                  <pic:blipFill>
+                    <a:blip r:embed="rId4"/>
+                    <a:stretch>
+                      <a:fillRect/>
+                    </a:stretch>
+                  </pic:blipFill>
+                  <pic:spPr>
+                    <a:xfrm>
+                      <a:off x="0" y="0"/>
+                      <a:ext cx="6048000" cy="5901000"/>
+                    </a:xfrm>
+                    <a:prstGeom prst="rect">
+                      <a:avLst/>
+                    </a:prstGeom>
+                  </pic:spPr>
+                </pic:pic>
+              </a:graphicData>
+            </a:graphic>
+          </wp:inline>
+        </w:drawing>
+      </w:r>
+    </w:p>
+    <w:p>
+      <w:pPr>
+        <w:pageBreakBefore/>
+        <w:keepNext/>
+      </w:pPr>
+      <w:r>
+        <w:t>Figura 5. Página WordPress instalada, capturada em celular.</w:t>
+      </w:r>
+    </w:p>
+    <w:p>
+      <w:r>
+        <w:drawing>
+          <wp:inline>
+            <wp:extent cx="1944000" cy="6599630"/>
+            <wp:docPr id="5" name="Captura real 5" descr="Página WordPress instalada, capturada em celular."/>
+            <a:graphic>
+              <a:graphicData uri="http://schemas.openxmlformats.org/drawingml/2006/picture">
+                <pic:pic>
+                  <pic:nvPicPr>
+                    <pic:cNvPr id="5" name="site-mobile.png"/>
+                    <pic:cNvPicPr/>
+                  </pic:nvPicPr>
+                  <pic:blipFill>
+                    <a:blip r:embed="rId5"/>
+                    <a:stretch>
+                      <a:fillRect/>
+                    </a:stretch>
+                  </pic:blipFill>
+                  <pic:spPr>
+                    <a:xfrm>
+                      <a:off x="0" y="0"/>
+                      <a:ext cx="1944000" cy="6599630"/>
+                    </a:xfrm>
+                    <a:prstGeom prst="rect">
+                      <a:avLst/>
+                    </a:prstGeom>
+                  </pic:spPr>
+                </pic:pic>
+              </a:graphicData>
+            </a:graphic>
+          </wp:inline>
+        </w:drawing>
+      </w:r>
+    </w:p>
+    <w:p>
+      <w:pPr>
+        <w:keepNext/>
+        <w:pageBreakBefore/>
+        <w:spacing w:after="140"/>
+      </w:pPr>
+      <w:r>
+        <w:rPr>
+          <w:b/>
+          <w:rFonts w:ascii="Arial" w:hAnsi="Arial"/>
+          <w:sz w:val="28"/>
+        </w:rPr>
+        <w:t xml:space="preserve">Conclusão</w:t>
+      </w:r>
+    </w:p>
+    <w:p>
+      <w:pPr>
+        <w:spacing w:after="140"/>
+      </w:pPr>
+      <w:r>
+        <w:rPr>
+          <w:rFonts w:ascii="Arial" w:hAnsi="Arial"/>
+          <w:sz w:val="23"/>
+        </w:rPr>
+        <w:t xml:space="preserve">O experimento foi validado localmente: Nginx distribuiu requisições entre três instâncias WordPress com arquivos e banco compartilhados, mantendo o conteúdo após parar e retomar. Os registros e capturas permitem conferir os resultados apresentados. As versões foram preservadas para a atividade e o teste não caracteriza dimensionamento para uso público.</w:t>
+      </w:r>
+    </w:p>
+    <w:p>
+      <w:pPr>
+        <w:spacing w:after="140"/>
+      </w:pPr>
+      <w:r>
+        <w:rPr>
+          <w:rFonts w:ascii="Arial" w:hAnsi="Arial"/>
+          <w:sz w:val="23"/>
+        </w:rPr>
+        <w:t xml:space="preserve">Código, dados, credenciais e evidências permanecem no SSD dedicado. O pacote público contém código e provas revisadas, sem credenciais, banco ou discos virtuais. Executáveis e componentes de integração do macOS continuam no disco interno.</w:t>
       </w:r>
     </w:p>
     <w:p>

</xml_diff>